<commit_message>
Verify model-retirement kit and link it from its niche
Co-Authored-By: Claude Opus 5.5 <noreply@anthropic.com>
Claude-Session: https://claude.ai/code/session_01DspfyLwNfeJ4CHdyACeRHQ
</commit_message>
<xml_diff>
--- a/kits/doc-accessibility/samples/source-files/summer-recreation-guide-2026.docx
+++ b/kits/doc-accessibility/samples/source-files/summer-recreation-guide-2026.docx
@@ -95,12 +95,13 @@
       <w:tblPr>
         <w:tblStyle w:val="TableGrid"/>
         <w:tblW w:type="auto" w:w="0"/>
+        <w:tblLayout w:type="fixed"/>
         <w:tblLook w:firstColumn="1" w:firstRow="1" w:lastColumn="0" w:lastRow="0" w:noHBand="0" w:noVBand="1" w:val="04A0"/>
       </w:tblPr>
       <w:tblGrid>
-        <w:gridCol w:w="2160"/>
-        <w:gridCol w:w="2160"/>
-        <w:gridCol w:w="2160"/>
+        <w:gridCol w:w="2304"/>
+        <w:gridCol w:w="1440"/>
+        <w:gridCol w:w="3168"/>
         <w:gridCol w:w="2160"/>
       </w:tblGrid>
       <w:tr>

</xml_diff>